<commit_message>
Add Linear Regression as model 0 and fix methodology page 404
- Add LinearRegression baseline to training pipeline (train_lr(), year
  coefficient printed as MIC creep rate, saved as lr_baseline_{sp}.pkl)
- Update results tables in notebook, HTML report, and DOCX with LR metrics
- Add 3-model accuracy/complexity/interpretability tradeoff discussion in
  notebook section 8.2 and frontend methodology page
- Create /methodology page (was 404) with full model comparison table
- Add Methodology nav link
- Expand report sections: 3-model text in 4.3, LR rows in Table 2
- Update README with run_all.sh launch instructions

Co-Authored-By: Claude Sonnet 4.6 <noreply@anthropic.com>
</commit_message>
<xml_diff>
--- a/reports/MIC_Creep_Report.docx
+++ b/reports/MIC_Creep_Report.docx
@@ -30,9 +30,9 @@
           <w:b w:val="0"/>
           <w:sz w:val="22"/>
         </w:rPr>
-        <w:t>Anna Gurina (Technical Lead) | Inna Gurina (Domain Expert)</w:t>
+        <w:t>Anna Gurina (Technical Lead) | Inna Kucherova (Research Lead / Domain Expert)</w:t>
         <w:br/>
-        <w:t>KSE Introduction to Machine Learning — Group Project</w:t>
+        <w:t>KSE Introduction to Machine Learning - Group Project</w:t>
       </w:r>
     </w:p>
     <w:p>
@@ -91,6 +91,72 @@
     </w:p>
     <w:p>
       <w:pPr>
+        <w:spacing w:before="120" w:after="60"/>
+      </w:pPr>
+      <w:r>
+        <w:rPr>
+          <w:rFonts w:ascii="Calibri" w:hAnsi="Calibri"/>
+          <w:b/>
+          <w:color w:val="000000"/>
+          <w:sz w:val="22"/>
+        </w:rPr>
+        <w:t>Why It Matters</w:t>
+      </w:r>
+    </w:p>
+    <w:p>
+      <w:pPr>
+        <w:spacing w:before="0" w:after="80"/>
+      </w:pPr>
+      <w:r>
+        <w:rPr>
+          <w:rFonts w:ascii="Calibri" w:hAnsi="Calibri"/>
+          <w:b w:val="0"/>
+          <w:sz w:val="22"/>
+        </w:rPr>
+        <w:t>Meropenem is a carbapenem antibiotic used as a last resort when all other options have failed. Both K. pneumoniae and A. baumannii appear on the WHO Global Priority Pathogen List as 'critical' threats - the highest tier. For these organisms, carbapenem resistance means virtually no remaining oral or intravenous treatment options.</w:t>
+      </w:r>
+    </w:p>
+    <w:p>
+      <w:pPr>
+        <w:spacing w:before="0" w:after="80"/>
+      </w:pPr>
+      <w:r>
+        <w:rPr>
+          <w:rFonts w:ascii="Calibri" w:hAnsi="Calibri"/>
+          <w:b w:val="0"/>
+          <w:sz w:val="22"/>
+        </w:rPr>
+        <w:t>The central failure of current surveillance is that it is binary: each isolate is classified Susceptible (S), Intermediate (I), or Resistant (R) against a fixed breakpoint. An isolate with MIC = 1 mg/L and one with MIC = 7 mg/L are both reported as 'S' against a breakpoint of 8 mg/L - but they are biologically very different. MIC creep is the gradual drift of that distribution upward, year over year. By the time enough isolates cross the breakpoint to trigger a formal resistance alert, therapeutic efficacy has already eroded for the preceding cohort.</w:t>
+      </w:r>
+    </w:p>
+    <w:p>
+      <w:pPr>
+        <w:spacing w:before="0" w:after="80"/>
+      </w:pPr>
+      <w:r>
+        <w:rPr>
+          <w:rFonts w:ascii="Calibri" w:hAnsi="Calibri"/>
+          <w:b w:val="0"/>
+          <w:sz w:val="22"/>
+        </w:rPr>
+        <w:t>Machine learning on log2(MIC) as a continuous target enables early detection of this drift before it becomes a clinical crisis - and provides quantitative forecasting that binary S/I/R reporting cannot.</w:t>
+      </w:r>
+    </w:p>
+    <w:p>
+      <w:pPr>
+        <w:spacing w:before="0" w:after="80"/>
+      </w:pPr>
+      <w:r>
+        <w:rPr>
+          <w:rFonts w:ascii="Calibri" w:hAnsi="Calibri"/>
+          <w:b w:val="0"/>
+          <w:sz w:val="22"/>
+        </w:rPr>
+        <w:t>Observed trends in our dataset: K. pneumoniae resistance (MIC &gt; 8 mg/L) rose from 5% (2007) to 20% (2022). A. baumannii was already at 39% resistance in 2006 and reached 69% by 2022 - with MIC90 pegged at the assay panel ceiling since 2005, indicating widespread pan-resistance.</w:t>
+      </w:r>
+    </w:p>
+    <w:p>
+      <w:pPr>
         <w:spacing w:before="200" w:after="60"/>
       </w:pPr>
       <w:r>
@@ -116,6 +182,19 @@
         <w:t>Source: ATLAS (Antimicrobial Testing Leadership and Surveillance, Pfizer), accessed via the Vivli AMR Register under a Data Use Agreement. The dataset spans 2004-2022 across 100+ countries. Raw data are stored locally and never committed to version control per Vivli data stewardship terms.</w:t>
       </w:r>
     </w:p>
+    <w:p>
+      <w:pPr>
+        <w:spacing w:before="0" w:after="80"/>
+      </w:pPr>
+      <w:r>
+        <w:rPr>
+          <w:rFonts w:ascii="Calibri" w:hAnsi="Calibri"/>
+          <w:b w:val="0"/>
+          <w:sz w:val="22"/>
+        </w:rPr>
+        <w:t>Table 1: Dataset summary</w:t>
+      </w:r>
+    </w:p>
     <w:tbl>
       <w:tblPr>
         <w:tblStyle w:val="TableGrid"/>
@@ -130,7 +209,7 @@
       <w:tr>
         <w:tc>
           <w:tcPr>
-            <w:tcW w:type="dxa" w:w="2880"/>
+            <w:tcW w:type="dxa" w:w="3168"/>
           </w:tcPr>
           <w:p>
             <w:pPr>
@@ -183,127 +262,7 @@
       <w:tr>
         <w:tc>
           <w:tcPr>
-            <w:tcW w:type="dxa" w:w="2880"/>
-          </w:tcPr>
-          <w:p/>
-        </w:tc>
-        <w:tc>
-          <w:tcPr>
-            <w:tcW w:type="dxa" w:w="2880"/>
-          </w:tcPr>
-          <w:p/>
-        </w:tc>
-        <w:tc>
-          <w:tcPr>
-            <w:tcW w:type="dxa" w:w="2880"/>
-          </w:tcPr>
-          <w:p/>
-        </w:tc>
-      </w:tr>
-      <w:tr>
-        <w:tc>
-          <w:tcPr>
-            <w:tcW w:type="dxa" w:w="2880"/>
-          </w:tcPr>
-          <w:p/>
-        </w:tc>
-        <w:tc>
-          <w:tcPr>
-            <w:tcW w:type="dxa" w:w="2880"/>
-          </w:tcPr>
-          <w:p/>
-        </w:tc>
-        <w:tc>
-          <w:tcPr>
-            <w:tcW w:type="dxa" w:w="2880"/>
-          </w:tcPr>
-          <w:p/>
-        </w:tc>
-      </w:tr>
-      <w:tr>
-        <w:tc>
-          <w:tcPr>
-            <w:tcW w:type="dxa" w:w="2880"/>
-          </w:tcPr>
-          <w:p/>
-        </w:tc>
-        <w:tc>
-          <w:tcPr>
-            <w:tcW w:type="dxa" w:w="2880"/>
-          </w:tcPr>
-          <w:p/>
-        </w:tc>
-        <w:tc>
-          <w:tcPr>
-            <w:tcW w:type="dxa" w:w="2880"/>
-          </w:tcPr>
-          <w:p/>
-        </w:tc>
-      </w:tr>
-      <w:tr>
-        <w:tc>
-          <w:tcPr>
-            <w:tcW w:type="dxa" w:w="2880"/>
-          </w:tcPr>
-          <w:p/>
-        </w:tc>
-        <w:tc>
-          <w:tcPr>
-            <w:tcW w:type="dxa" w:w="2880"/>
-          </w:tcPr>
-          <w:p/>
-        </w:tc>
-        <w:tc>
-          <w:tcPr>
-            <w:tcW w:type="dxa" w:w="2880"/>
-          </w:tcPr>
-          <w:p/>
-        </w:tc>
-      </w:tr>
-      <w:tr>
-        <w:tc>
-          <w:tcPr>
-            <w:tcW w:type="dxa" w:w="2880"/>
-          </w:tcPr>
-          <w:p/>
-        </w:tc>
-        <w:tc>
-          <w:tcPr>
-            <w:tcW w:type="dxa" w:w="2880"/>
-          </w:tcPr>
-          <w:p/>
-        </w:tc>
-        <w:tc>
-          <w:tcPr>
-            <w:tcW w:type="dxa" w:w="2880"/>
-          </w:tcPr>
-          <w:p/>
-        </w:tc>
-      </w:tr>
-      <w:tr>
-        <w:tc>
-          <w:tcPr>
-            <w:tcW w:type="dxa" w:w="2880"/>
-          </w:tcPr>
-          <w:p/>
-        </w:tc>
-        <w:tc>
-          <w:tcPr>
-            <w:tcW w:type="dxa" w:w="2880"/>
-          </w:tcPr>
-          <w:p/>
-        </w:tc>
-        <w:tc>
-          <w:tcPr>
-            <w:tcW w:type="dxa" w:w="2880"/>
-          </w:tcPr>
-          <w:p/>
-        </w:tc>
-      </w:tr>
-      <w:tr>
-        <w:tc>
-          <w:tcPr>
-            <w:tcW w:type="dxa" w:w="2880"/>
+            <w:tcW w:type="dxa" w:w="3168"/>
           </w:tcPr>
           <w:p>
             <w:pPr>
@@ -353,7 +312,7 @@
       <w:tr>
         <w:tc>
           <w:tcPr>
-            <w:tcW w:type="dxa" w:w="2880"/>
+            <w:tcW w:type="dxa" w:w="3168"/>
           </w:tcPr>
           <w:p>
             <w:pPr>
@@ -403,7 +362,7 @@
       <w:tr>
         <w:tc>
           <w:tcPr>
-            <w:tcW w:type="dxa" w:w="2880"/>
+            <w:tcW w:type="dxa" w:w="3168"/>
           </w:tcPr>
           <w:p>
             <w:pPr>
@@ -453,7 +412,7 @@
       <w:tr>
         <w:tc>
           <w:tcPr>
-            <w:tcW w:type="dxa" w:w="2880"/>
+            <w:tcW w:type="dxa" w:w="3168"/>
           </w:tcPr>
           <w:p>
             <w:pPr>
@@ -503,7 +462,7 @@
       <w:tr>
         <w:tc>
           <w:tcPr>
-            <w:tcW w:type="dxa" w:w="2880"/>
+            <w:tcW w:type="dxa" w:w="3168"/>
           </w:tcPr>
           <w:p>
             <w:pPr>
@@ -553,7 +512,7 @@
       <w:tr>
         <w:tc>
           <w:tcPr>
-            <w:tcW w:type="dxa" w:w="2880"/>
+            <w:tcW w:type="dxa" w:w="3168"/>
           </w:tcPr>
           <w:p>
             <w:pPr>
@@ -563,7 +522,7 @@
               <w:rPr>
                 <w:sz w:val="20"/>
               </w:rPr>
-              <w:t>% resistant (MIC&gt;8)</w:t>
+              <w:t>% resistant (MIC&gt;8 mg/L)</w:t>
             </w:r>
           </w:p>
         </w:tc>
@@ -600,6 +559,839 @@
           </w:p>
         </w:tc>
       </w:tr>
+      <w:tr>
+        <w:tc>
+          <w:tcPr>
+            <w:tcW w:type="dxa" w:w="3168"/>
+          </w:tcPr>
+          <w:p>
+            <w:pPr>
+              <w:jc w:val="center"/>
+            </w:pPr>
+            <w:r>
+              <w:rPr>
+                <w:sz w:val="20"/>
+              </w:rPr>
+              <w:t>MIC90 trend</w:t>
+            </w:r>
+          </w:p>
+        </w:tc>
+        <w:tc>
+          <w:tcPr>
+            <w:tcW w:type="dxa" w:w="2880"/>
+          </w:tcPr>
+          <w:p>
+            <w:pPr>
+              <w:jc w:val="center"/>
+            </w:pPr>
+            <w:r>
+              <w:rPr>
+                <w:sz w:val="20"/>
+              </w:rPr>
+              <w:t>+1.97 mg/L/yr (R2=0.67)</w:t>
+            </w:r>
+          </w:p>
+        </w:tc>
+        <w:tc>
+          <w:tcPr>
+            <w:tcW w:type="dxa" w:w="2880"/>
+          </w:tcPr>
+          <w:p>
+            <w:pPr>
+              <w:jc w:val="center"/>
+            </w:pPr>
+            <w:r>
+              <w:rPr>
+                <w:sz w:val="20"/>
+              </w:rPr>
+              <w:t>At ceiling since 2005</w:t>
+            </w:r>
+          </w:p>
+        </w:tc>
+      </w:tr>
+    </w:tbl>
+    <w:p/>
+    <w:p>
+      <w:pPr>
+        <w:spacing w:before="120" w:after="60"/>
+      </w:pPr>
+      <w:r>
+        <w:rPr>
+          <w:rFonts w:ascii="Calibri" w:hAnsi="Calibri"/>
+          <w:b/>
+          <w:color w:val="000000"/>
+          <w:sz w:val="22"/>
+        </w:rPr>
+        <w:t>3.1 Variables Used</w:t>
+      </w:r>
+    </w:p>
+    <w:p>
+      <w:pPr>
+        <w:spacing w:before="0" w:after="80"/>
+      </w:pPr>
+      <w:r>
+        <w:rPr>
+          <w:rFonts w:ascii="Calibri" w:hAnsi="Calibri"/>
+          <w:b w:val="0"/>
+          <w:sz w:val="22"/>
+        </w:rPr>
+        <w:t>Raw ATLAS columns used and their derived features:</w:t>
+      </w:r>
+    </w:p>
+    <w:p>
+      <w:pPr>
+        <w:spacing w:before="0" w:after="80"/>
+      </w:pPr>
+      <w:r>
+        <w:rPr>
+          <w:rFonts w:ascii="Calibri" w:hAnsi="Calibri"/>
+          <w:b w:val="0"/>
+          <w:sz w:val="22"/>
+        </w:rPr>
+        <w:t>Table 2: Feature variables</w:t>
+      </w:r>
+    </w:p>
+    <w:tbl>
+      <w:tblPr>
+        <w:tblStyle w:val="TableGrid"/>
+        <w:tblW w:type="auto" w:w="0"/>
+        <w:tblLook w:firstColumn="1" w:firstRow="1" w:lastColumn="0" w:lastRow="0" w:noHBand="0" w:noVBand="1" w:val="04A0"/>
+      </w:tblPr>
+      <w:tblGrid>
+        <w:gridCol w:w="2340"/>
+        <w:gridCol w:w="2340"/>
+        <w:gridCol w:w="2340"/>
+        <w:gridCol w:w="2340"/>
+      </w:tblGrid>
+      <w:tr>
+        <w:tc>
+          <w:tcPr>
+            <w:tcW w:type="dxa" w:w="2304"/>
+          </w:tcPr>
+          <w:p>
+            <w:pPr>
+              <w:jc w:val="center"/>
+            </w:pPr>
+            <w:r>
+              <w:rPr>
+                <w:b/>
+                <w:sz w:val="20"/>
+              </w:rPr>
+              <w:t>Feature</w:t>
+            </w:r>
+          </w:p>
+        </w:tc>
+        <w:tc>
+          <w:tcPr>
+            <w:tcW w:type="dxa" w:w="1440"/>
+          </w:tcPr>
+          <w:p>
+            <w:pPr>
+              <w:jc w:val="center"/>
+            </w:pPr>
+            <w:r>
+              <w:rPr>
+                <w:b/>
+                <w:sz w:val="20"/>
+              </w:rPr>
+              <w:t>Type</w:t>
+            </w:r>
+          </w:p>
+        </w:tc>
+        <w:tc>
+          <w:tcPr>
+            <w:tcW w:type="dxa" w:w="2016"/>
+          </w:tcPr>
+          <w:p>
+            <w:pPr>
+              <w:jc w:val="center"/>
+            </w:pPr>
+            <w:r>
+              <w:rPr>
+                <w:b/>
+                <w:sz w:val="20"/>
+              </w:rPr>
+              <w:t>Derived from</w:t>
+            </w:r>
+          </w:p>
+        </w:tc>
+        <w:tc>
+          <w:tcPr>
+            <w:tcW w:type="dxa" w:w="2304"/>
+          </w:tcPr>
+          <w:p>
+            <w:pPr>
+              <w:jc w:val="center"/>
+            </w:pPr>
+            <w:r>
+              <w:rPr>
+                <w:b/>
+                <w:sz w:val="20"/>
+              </w:rPr>
+              <w:t>Notes</w:t>
+            </w:r>
+          </w:p>
+        </w:tc>
+      </w:tr>
+      <w:tr>
+        <w:tc>
+          <w:tcPr>
+            <w:tcW w:type="dxa" w:w="2304"/>
+          </w:tcPr>
+          <w:p>
+            <w:pPr>
+              <w:jc w:val="center"/>
+            </w:pPr>
+            <w:r>
+              <w:rPr>
+                <w:sz w:val="20"/>
+              </w:rPr>
+              <w:t>year</w:t>
+            </w:r>
+          </w:p>
+        </w:tc>
+        <w:tc>
+          <w:tcPr>
+            <w:tcW w:type="dxa" w:w="1440"/>
+          </w:tcPr>
+          <w:p>
+            <w:pPr>
+              <w:jc w:val="center"/>
+            </w:pPr>
+            <w:r>
+              <w:rPr>
+                <w:sz w:val="20"/>
+              </w:rPr>
+              <w:t>Continuous</w:t>
+            </w:r>
+          </w:p>
+        </w:tc>
+        <w:tc>
+          <w:tcPr>
+            <w:tcW w:type="dxa" w:w="2016"/>
+          </w:tcPr>
+          <w:p>
+            <w:pPr>
+              <w:jc w:val="center"/>
+            </w:pPr>
+            <w:r>
+              <w:rPr>
+                <w:sz w:val="20"/>
+              </w:rPr>
+              <w:t>Collection year</w:t>
+            </w:r>
+          </w:p>
+        </w:tc>
+        <w:tc>
+          <w:tcPr>
+            <w:tcW w:type="dxa" w:w="2304"/>
+          </w:tcPr>
+          <w:p>
+            <w:pPr>
+              <w:jc w:val="center"/>
+            </w:pPr>
+            <w:r>
+              <w:rPr>
+                <w:sz w:val="20"/>
+              </w:rPr>
+              <w:t>Primary MIC creep driver</w:t>
+            </w:r>
+          </w:p>
+        </w:tc>
+      </w:tr>
+      <w:tr>
+        <w:tc>
+          <w:tcPr>
+            <w:tcW w:type="dxa" w:w="2304"/>
+          </w:tcPr>
+          <w:p>
+            <w:pPr>
+              <w:jc w:val="center"/>
+            </w:pPr>
+            <w:r>
+              <w:rPr>
+                <w:sz w:val="20"/>
+              </w:rPr>
+              <w:t>gender_male</w:t>
+            </w:r>
+          </w:p>
+        </w:tc>
+        <w:tc>
+          <w:tcPr>
+            <w:tcW w:type="dxa" w:w="1440"/>
+          </w:tcPr>
+          <w:p>
+            <w:pPr>
+              <w:jc w:val="center"/>
+            </w:pPr>
+            <w:r>
+              <w:rPr>
+                <w:sz w:val="20"/>
+              </w:rPr>
+              <w:t>Binary (0/1)</w:t>
+            </w:r>
+          </w:p>
+        </w:tc>
+        <w:tc>
+          <w:tcPr>
+            <w:tcW w:type="dxa" w:w="2016"/>
+          </w:tcPr>
+          <w:p>
+            <w:pPr>
+              <w:jc w:val="center"/>
+            </w:pPr>
+            <w:r>
+              <w:rPr>
+                <w:sz w:val="20"/>
+              </w:rPr>
+              <w:t>Gender field</w:t>
+            </w:r>
+          </w:p>
+        </w:tc>
+        <w:tc>
+          <w:tcPr>
+            <w:tcW w:type="dxa" w:w="2304"/>
+          </w:tcPr>
+          <w:p>
+            <w:pPr>
+              <w:jc w:val="center"/>
+            </w:pPr>
+            <w:r>
+              <w:rPr>
+                <w:sz w:val="20"/>
+              </w:rPr>
+              <w:t>Female is reference</w:t>
+            </w:r>
+          </w:p>
+        </w:tc>
+      </w:tr>
+      <w:tr>
+        <w:tc>
+          <w:tcPr>
+            <w:tcW w:type="dxa" w:w="2304"/>
+          </w:tcPr>
+          <w:p>
+            <w:pPr>
+              <w:jc w:val="center"/>
+            </w:pPr>
+            <w:r>
+              <w:rPr>
+                <w:sz w:val="20"/>
+              </w:rPr>
+              <w:t>age_paediatric</w:t>
+            </w:r>
+          </w:p>
+        </w:tc>
+        <w:tc>
+          <w:tcPr>
+            <w:tcW w:type="dxa" w:w="1440"/>
+          </w:tcPr>
+          <w:p>
+            <w:pPr>
+              <w:jc w:val="center"/>
+            </w:pPr>
+            <w:r>
+              <w:rPr>
+                <w:sz w:val="20"/>
+              </w:rPr>
+              <w:t>Binary (0/1)</w:t>
+            </w:r>
+          </w:p>
+        </w:tc>
+        <w:tc>
+          <w:tcPr>
+            <w:tcW w:type="dxa" w:w="2016"/>
+          </w:tcPr>
+          <w:p>
+            <w:pPr>
+              <w:jc w:val="center"/>
+            </w:pPr>
+            <w:r>
+              <w:rPr>
+                <w:sz w:val="20"/>
+              </w:rPr>
+              <w:t>Age Group 0-17</w:t>
+            </w:r>
+          </w:p>
+        </w:tc>
+        <w:tc>
+          <w:tcPr>
+            <w:tcW w:type="dxa" w:w="2304"/>
+          </w:tcPr>
+          <w:p>
+            <w:pPr>
+              <w:jc w:val="center"/>
+            </w:pPr>
+            <w:r>
+              <w:rPr>
+                <w:sz w:val="20"/>
+              </w:rPr>
+              <w:t>Adult (18-60) is reference</w:t>
+            </w:r>
+          </w:p>
+        </w:tc>
+      </w:tr>
+      <w:tr>
+        <w:tc>
+          <w:tcPr>
+            <w:tcW w:type="dxa" w:w="2304"/>
+          </w:tcPr>
+          <w:p>
+            <w:pPr>
+              <w:jc w:val="center"/>
+            </w:pPr>
+            <w:r>
+              <w:rPr>
+                <w:sz w:val="20"/>
+              </w:rPr>
+              <w:t>age_elderly</w:t>
+            </w:r>
+          </w:p>
+        </w:tc>
+        <w:tc>
+          <w:tcPr>
+            <w:tcW w:type="dxa" w:w="1440"/>
+          </w:tcPr>
+          <w:p>
+            <w:pPr>
+              <w:jc w:val="center"/>
+            </w:pPr>
+            <w:r>
+              <w:rPr>
+                <w:sz w:val="20"/>
+              </w:rPr>
+              <w:t>Binary (0/1)</w:t>
+            </w:r>
+          </w:p>
+        </w:tc>
+        <w:tc>
+          <w:tcPr>
+            <w:tcW w:type="dxa" w:w="2016"/>
+          </w:tcPr>
+          <w:p>
+            <w:pPr>
+              <w:jc w:val="center"/>
+            </w:pPr>
+            <w:r>
+              <w:rPr>
+                <w:sz w:val="20"/>
+              </w:rPr>
+              <w:t>Age Group 61+</w:t>
+            </w:r>
+          </w:p>
+        </w:tc>
+        <w:tc>
+          <w:tcPr>
+            <w:tcW w:type="dxa" w:w="2304"/>
+          </w:tcPr>
+          <w:p>
+            <w:pPr>
+              <w:jc w:val="center"/>
+            </w:pPr>
+            <w:r>
+              <w:rPr>
+                <w:sz w:val="20"/>
+              </w:rPr>
+            </w:r>
+          </w:p>
+        </w:tc>
+      </w:tr>
+      <w:tr>
+        <w:tc>
+          <w:tcPr>
+            <w:tcW w:type="dxa" w:w="2304"/>
+          </w:tcPr>
+          <w:p>
+            <w:pPr>
+              <w:jc w:val="center"/>
+            </w:pPr>
+            <w:r>
+              <w:rPr>
+                <w:sz w:val="20"/>
+              </w:rPr>
+              <w:t>military_proxy</w:t>
+            </w:r>
+          </w:p>
+        </w:tc>
+        <w:tc>
+          <w:tcPr>
+            <w:tcW w:type="dxa" w:w="1440"/>
+          </w:tcPr>
+          <w:p>
+            <w:pPr>
+              <w:jc w:val="center"/>
+            </w:pPr>
+            <w:r>
+              <w:rPr>
+                <w:sz w:val="20"/>
+              </w:rPr>
+              <w:t>Binary (0/1)</w:t>
+            </w:r>
+          </w:p>
+        </w:tc>
+        <w:tc>
+          <w:tcPr>
+            <w:tcW w:type="dxa" w:w="2016"/>
+          </w:tcPr>
+          <w:p>
+            <w:pPr>
+              <w:jc w:val="center"/>
+            </w:pPr>
+            <w:r>
+              <w:rPr>
+                <w:sz w:val="20"/>
+              </w:rPr>
+              <w:t>wound + male + 18-60</w:t>
+            </w:r>
+          </w:p>
+        </w:tc>
+        <w:tc>
+          <w:tcPr>
+            <w:tcW w:type="dxa" w:w="2304"/>
+          </w:tcPr>
+          <w:p>
+            <w:pPr>
+              <w:jc w:val="center"/>
+            </w:pPr>
+            <w:r>
+              <w:rPr>
+                <w:sz w:val="20"/>
+              </w:rPr>
+              <w:t>Combat infection proxy</w:t>
+            </w:r>
+          </w:p>
+        </w:tc>
+      </w:tr>
+      <w:tr>
+        <w:tc>
+          <w:tcPr>
+            <w:tcW w:type="dxa" w:w="2304"/>
+          </w:tcPr>
+          <w:p>
+            <w:pPr>
+              <w:jc w:val="center"/>
+            </w:pPr>
+            <w:r>
+              <w:rPr>
+                <w:sz w:val="20"/>
+              </w:rPr>
+              <w:t>spec_wound / blood / respiratory / urine / peritoneal</w:t>
+            </w:r>
+          </w:p>
+        </w:tc>
+        <w:tc>
+          <w:tcPr>
+            <w:tcW w:type="dxa" w:w="1440"/>
+          </w:tcPr>
+          <w:p>
+            <w:pPr>
+              <w:jc w:val="center"/>
+            </w:pPr>
+            <w:r>
+              <w:rPr>
+                <w:sz w:val="20"/>
+              </w:rPr>
+              <w:t>Binary OHE (5)</w:t>
+            </w:r>
+          </w:p>
+        </w:tc>
+        <w:tc>
+          <w:tcPr>
+            <w:tcW w:type="dxa" w:w="2016"/>
+          </w:tcPr>
+          <w:p>
+            <w:pPr>
+              <w:jc w:val="center"/>
+            </w:pPr>
+            <w:r>
+              <w:rPr>
+                <w:sz w:val="20"/>
+              </w:rPr>
+              <w:t>Source field</w:t>
+            </w:r>
+          </w:p>
+        </w:tc>
+        <w:tc>
+          <w:tcPr>
+            <w:tcW w:type="dxa" w:w="2304"/>
+          </w:tcPr>
+          <w:p>
+            <w:pPr>
+              <w:jc w:val="center"/>
+            </w:pPr>
+            <w:r>
+              <w:rPr>
+                <w:sz w:val="20"/>
+              </w:rPr>
+              <w:t>Other is reference</w:t>
+            </w:r>
+          </w:p>
+        </w:tc>
+      </w:tr>
+      <w:tr>
+        <w:tc>
+          <w:tcPr>
+            <w:tcW w:type="dxa" w:w="2304"/>
+          </w:tcPr>
+          <w:p>
+            <w:pPr>
+              <w:jc w:val="center"/>
+            </w:pPr>
+            <w:r>
+              <w:rPr>
+                <w:sz w:val="20"/>
+              </w:rPr>
+              <w:t>ctry_*</w:t>
+            </w:r>
+          </w:p>
+        </w:tc>
+        <w:tc>
+          <w:tcPr>
+            <w:tcW w:type="dxa" w:w="1440"/>
+          </w:tcPr>
+          <w:p>
+            <w:pPr>
+              <w:jc w:val="center"/>
+            </w:pPr>
+            <w:r>
+              <w:rPr>
+                <w:sz w:val="20"/>
+              </w:rPr>
+              <w:t>Binary OHE (81/79)</w:t>
+            </w:r>
+          </w:p>
+        </w:tc>
+        <w:tc>
+          <w:tcPr>
+            <w:tcW w:type="dxa" w:w="2016"/>
+          </w:tcPr>
+          <w:p>
+            <w:pPr>
+              <w:jc w:val="center"/>
+            </w:pPr>
+            <w:r>
+              <w:rPr>
+                <w:sz w:val="20"/>
+              </w:rPr>
+              <w:t>Country field</w:t>
+            </w:r>
+          </w:p>
+        </w:tc>
+        <w:tc>
+          <w:tcPr>
+            <w:tcW w:type="dxa" w:w="2304"/>
+          </w:tcPr>
+          <w:p>
+            <w:pPr>
+              <w:jc w:val="center"/>
+            </w:pPr>
+            <w:r>
+              <w:rPr>
+                <w:sz w:val="20"/>
+              </w:rPr>
+              <w:t>Top-N countries + Other</w:t>
+            </w:r>
+          </w:p>
+        </w:tc>
+      </w:tr>
+      <w:tr>
+        <w:tc>
+          <w:tcPr>
+            <w:tcW w:type="dxa" w:w="2304"/>
+          </w:tcPr>
+          <w:p>
+            <w:pPr>
+              <w:jc w:val="center"/>
+            </w:pPr>
+            <w:r>
+              <w:rPr>
+                <w:sz w:val="20"/>
+              </w:rPr>
+              <w:t>KPC_pos, NDM_pos, OXA_pos, VIM_pos, IMP_pos, GES_pos</w:t>
+            </w:r>
+          </w:p>
+        </w:tc>
+        <w:tc>
+          <w:tcPr>
+            <w:tcW w:type="dxa" w:w="1440"/>
+          </w:tcPr>
+          <w:p>
+            <w:pPr>
+              <w:jc w:val="center"/>
+            </w:pPr>
+            <w:r>
+              <w:rPr>
+                <w:sz w:val="20"/>
+              </w:rPr>
+              <w:t>Binary (0/1)</w:t>
+            </w:r>
+          </w:p>
+        </w:tc>
+        <w:tc>
+          <w:tcPr>
+            <w:tcW w:type="dxa" w:w="2016"/>
+          </w:tcPr>
+          <w:p>
+            <w:pPr>
+              <w:jc w:val="center"/>
+            </w:pPr>
+            <w:r>
+              <w:rPr>
+                <w:sz w:val="20"/>
+              </w:rPr>
+              <w:t>PCR resistance genes</w:t>
+            </w:r>
+          </w:p>
+        </w:tc>
+        <w:tc>
+          <w:tcPr>
+            <w:tcW w:type="dxa" w:w="2304"/>
+          </w:tcPr>
+          <w:p>
+            <w:pPr>
+              <w:jc w:val="center"/>
+            </w:pPr>
+            <w:r>
+              <w:rPr>
+                <w:sz w:val="20"/>
+              </w:rPr>
+              <w:t>ATLAS panel</w:t>
+            </w:r>
+          </w:p>
+        </w:tc>
+      </w:tr>
+      <w:tr>
+        <w:tc>
+          <w:tcPr>
+            <w:tcW w:type="dxa" w:w="2304"/>
+          </w:tcPr>
+          <w:p>
+            <w:pPr>
+              <w:jc w:val="center"/>
+            </w:pPr>
+            <w:r>
+              <w:rPr>
+                <w:sz w:val="20"/>
+              </w:rPr>
+              <w:t>is_censored</w:t>
+            </w:r>
+          </w:p>
+        </w:tc>
+        <w:tc>
+          <w:tcPr>
+            <w:tcW w:type="dxa" w:w="1440"/>
+          </w:tcPr>
+          <w:p>
+            <w:pPr>
+              <w:jc w:val="center"/>
+            </w:pPr>
+            <w:r>
+              <w:rPr>
+                <w:sz w:val="20"/>
+              </w:rPr>
+              <w:t>Binary (0/1)</w:t>
+            </w:r>
+          </w:p>
+        </w:tc>
+        <w:tc>
+          <w:tcPr>
+            <w:tcW w:type="dxa" w:w="2016"/>
+          </w:tcPr>
+          <w:p>
+            <w:pPr>
+              <w:jc w:val="center"/>
+            </w:pPr>
+            <w:r>
+              <w:rPr>
+                <w:sz w:val="20"/>
+              </w:rPr>
+              <w:t>MIC operator (&gt;, &lt;=)</w:t>
+            </w:r>
+          </w:p>
+        </w:tc>
+        <w:tc>
+          <w:tcPr>
+            <w:tcW w:type="dxa" w:w="2304"/>
+          </w:tcPr>
+          <w:p>
+            <w:pPr>
+              <w:jc w:val="center"/>
+            </w:pPr>
+            <w:r>
+              <w:rPr>
+                <w:sz w:val="20"/>
+              </w:rPr>
+              <w:t>Data artifact flag</w:t>
+            </w:r>
+          </w:p>
+        </w:tc>
+      </w:tr>
+      <w:tr>
+        <w:tc>
+          <w:tcPr>
+            <w:tcW w:type="dxa" w:w="2304"/>
+          </w:tcPr>
+          <w:p>
+            <w:pPr>
+              <w:jc w:val="center"/>
+            </w:pPr>
+            <w:r>
+              <w:rPr>
+                <w:sz w:val="20"/>
+              </w:rPr>
+              <w:t>pct_censored_year</w:t>
+            </w:r>
+          </w:p>
+        </w:tc>
+        <w:tc>
+          <w:tcPr>
+            <w:tcW w:type="dxa" w:w="1440"/>
+          </w:tcPr>
+          <w:p>
+            <w:pPr>
+              <w:jc w:val="center"/>
+            </w:pPr>
+            <w:r>
+              <w:rPr>
+                <w:sz w:val="20"/>
+              </w:rPr>
+              <w:t>Float [0,1]</w:t>
+            </w:r>
+          </w:p>
+        </w:tc>
+        <w:tc>
+          <w:tcPr>
+            <w:tcW w:type="dxa" w:w="2016"/>
+          </w:tcPr>
+          <w:p>
+            <w:pPr>
+              <w:jc w:val="center"/>
+            </w:pPr>
+            <w:r>
+              <w:rPr>
+                <w:sz w:val="20"/>
+              </w:rPr>
+              <w:t>Computed per year</w:t>
+            </w:r>
+          </w:p>
+        </w:tc>
+        <w:tc>
+          <w:tcPr>
+            <w:tcW w:type="dxa" w:w="2304"/>
+          </w:tcPr>
+          <w:p>
+            <w:pPr>
+              <w:jc w:val="center"/>
+            </w:pPr>
+            <w:r>
+              <w:rPr>
+                <w:sz w:val="20"/>
+              </w:rPr>
+              <w:t>Controls panel methodology shifts</w:t>
+            </w:r>
+          </w:p>
+        </w:tc>
+      </w:tr>
     </w:tbl>
     <w:p/>
     <w:p>
@@ -612,7 +1404,610 @@
           <w:b w:val="0"/>
           <w:sz w:val="22"/>
         </w:rPr>
-        <w:t>Censored MIC entries (e.g., &gt;8, &lt;=0.5) were resolved using boundary doubling dilution imputation before log2-transformation. Merck/SMART datasets were excluded per challenge rules.</w:t>
+        <w:t>Target variable: log2(MIC_numeric) - continuous regression target.</w:t>
+      </w:r>
+    </w:p>
+    <w:p>
+      <w:pPr>
+        <w:spacing w:before="120" w:after="60"/>
+      </w:pPr>
+      <w:r>
+        <w:rPr>
+          <w:rFonts w:ascii="Calibri" w:hAnsi="Calibri"/>
+          <w:b/>
+          <w:color w:val="000000"/>
+          <w:sz w:val="22"/>
+        </w:rPr>
+        <w:t>3.2 Data Cleaning Procedures</w:t>
+      </w:r>
+    </w:p>
+    <w:p>
+      <w:pPr>
+        <w:spacing w:before="0" w:after="80"/>
+      </w:pPr>
+      <w:r>
+        <w:rPr>
+          <w:rFonts w:ascii="Calibri" w:hAnsi="Calibri"/>
+          <w:b w:val="0"/>
+          <w:sz w:val="22"/>
+        </w:rPr>
+        <w:t>MIC string parsing: Raw ATLAS MIC values are stored as strings with comparison operators (e.g., '&gt;8', '&lt;=0.5', '0.25'). A regex parser extracts the operator and numeric value. Unparseable entries (malformed strings, nulls) are dropped.</w:t>
+      </w:r>
+    </w:p>
+    <w:p>
+      <w:pPr>
+        <w:spacing w:before="0" w:after="80"/>
+      </w:pPr>
+      <w:r>
+        <w:rPr>
+          <w:rFonts w:ascii="Calibri" w:hAnsi="Calibri"/>
+          <w:b w:val="0"/>
+          <w:sz w:val="22"/>
+        </w:rPr>
+        <w:t>Censored MIC imputation: When the assay panel cannot bound the true MIC, labs report censored values. These are resolved using boundary doubling-dilution logic: &gt;8 -&gt; 16 (one step above ceiling), &lt;=0.5 -&gt; 0.25 (one step below floor). This is a conservative approximation - it systematically underestimates true MIC for highly resistant isolates, which is acknowledged as a limitation.</w:t>
+      </w:r>
+    </w:p>
+    <w:p>
+      <w:pPr>
+        <w:spacing w:before="0" w:after="80"/>
+      </w:pPr>
+      <w:r>
+        <w:rPr>
+          <w:rFonts w:ascii="Calibri" w:hAnsi="Calibri"/>
+          <w:b w:val="0"/>
+          <w:sz w:val="22"/>
+        </w:rPr>
+        <w:t>Log2 transformation: MIC values follow a log-normal distribution due to the doubling-dilution assay design. Log2 transformation produces a near-symmetric distribution suitable for regression. Each integer unit in log2 space corresponds to one doubling dilution step (a clinically standard unit of comparison).</w:t>
+      </w:r>
+    </w:p>
+    <w:p>
+      <w:pPr>
+        <w:spacing w:before="0" w:after="80"/>
+      </w:pPr>
+      <w:r>
+        <w:rPr>
+          <w:rFonts w:ascii="Calibri" w:hAnsi="Calibri"/>
+          <w:b w:val="0"/>
+          <w:sz w:val="22"/>
+        </w:rPr>
+        <w:t>Specimen type standardization: The free-text Source field is mapped to 5 categories (wound, blood, respiratory, urine, peritoneal) using substring matching. Unmatched entries are labeled 'other' (reference category).</w:t>
+      </w:r>
+    </w:p>
+    <w:p>
+      <w:pPr>
+        <w:spacing w:before="0" w:after="80"/>
+      </w:pPr>
+      <w:r>
+        <w:rPr>
+          <w:rFonts w:ascii="Calibri" w:hAnsi="Calibri"/>
+          <w:b w:val="0"/>
+          <w:sz w:val="22"/>
+        </w:rPr>
+        <w:t>Country encoding: All countries appearing in the training set are one-hot encoded. Countries appearing only in the test set (or infrequently) are grouped as the reference category via drop_first encoding. This handles novel surveillance regions without breaking the model.</w:t>
+      </w:r>
+    </w:p>
+    <w:p>
+      <w:pPr>
+        <w:spacing w:before="0" w:after="80"/>
+      </w:pPr>
+      <w:r>
+        <w:rPr>
+          <w:rFonts w:ascii="Calibri" w:hAnsi="Calibri"/>
+          <w:b w:val="0"/>
+          <w:sz w:val="22"/>
+        </w:rPr>
+        <w:t>Dataset filter: Only Meropenem measurements are retained. Merck/SMART data were excluded per Vivli challenge rules.</w:t>
+      </w:r>
+    </w:p>
+    <w:p>
+      <w:pPr>
+        <w:spacing w:before="120" w:after="60"/>
+      </w:pPr>
+      <w:r>
+        <w:rPr>
+          <w:rFonts w:ascii="Calibri" w:hAnsi="Calibri"/>
+          <w:b/>
+          <w:color w:val="000000"/>
+          <w:sz w:val="22"/>
+        </w:rPr>
+        <w:t>3.3 Missing Value Treatment</w:t>
+      </w:r>
+    </w:p>
+    <w:p>
+      <w:pPr>
+        <w:spacing w:before="0" w:after="80"/>
+      </w:pPr>
+      <w:r>
+        <w:rPr>
+          <w:rFonts w:ascii="Calibri" w:hAnsi="Calibri"/>
+          <w:b w:val="0"/>
+          <w:sz w:val="22"/>
+        </w:rPr>
+        <w:t>MIC value: rows with null or unparseable MIC are dropped (~0.3% of records). No imputation - a null MIC cannot be meaningfully approximated.</w:t>
+      </w:r>
+    </w:p>
+    <w:p>
+      <w:pPr>
+        <w:spacing w:before="0" w:after="80"/>
+      </w:pPr>
+      <w:r>
+        <w:rPr>
+          <w:rFonts w:ascii="Calibri" w:hAnsi="Calibri"/>
+          <w:b w:val="0"/>
+          <w:sz w:val="22"/>
+        </w:rPr>
+        <w:t>Gender: missing gender is treated as a separate category (not imputed). The gender_male binary flag is 0 for both female and unknown.</w:t>
+      </w:r>
+    </w:p>
+    <w:p>
+      <w:pPr>
+        <w:spacing w:before="0" w:after="80"/>
+      </w:pPr>
+      <w:r>
+        <w:rPr>
+          <w:rFonts w:ascii="Calibri" w:hAnsi="Calibri"/>
+          <w:b w:val="0"/>
+          <w:sz w:val="22"/>
+        </w:rPr>
+        <w:t>Age group: missing age is treated as 'adult' (reference category) - both age_paediatric and age_elderly flags are 0.</w:t>
+      </w:r>
+    </w:p>
+    <w:p>
+      <w:pPr>
+        <w:spacing w:before="0" w:after="80"/>
+      </w:pPr>
+      <w:r>
+        <w:rPr>
+          <w:rFonts w:ascii="Calibri" w:hAnsi="Calibri"/>
+          <w:b w:val="0"/>
+          <w:sz w:val="22"/>
+        </w:rPr>
+        <w:t>Country: missing or unrecognized country is absorbed into the reference category (no separate OHE column created). The model does not see it as a distinct signal.</w:t>
+      </w:r>
+    </w:p>
+    <w:p>
+      <w:pPr>
+        <w:spacing w:before="0" w:after="80"/>
+      </w:pPr>
+      <w:r>
+        <w:rPr>
+          <w:rFonts w:ascii="Calibri" w:hAnsi="Calibri"/>
+          <w:b w:val="0"/>
+          <w:sz w:val="22"/>
+        </w:rPr>
+        <w:t>Specimen source: NaN source is mapped to 'other' (reference category) by the map_specimen function.</w:t>
+      </w:r>
+    </w:p>
+    <w:p>
+      <w:pPr>
+        <w:spacing w:before="0" w:after="80"/>
+      </w:pPr>
+      <w:r>
+        <w:rPr>
+          <w:rFonts w:ascii="Calibri" w:hAnsi="Calibri"/>
+          <w:b w:val="0"/>
+          <w:sz w:val="22"/>
+        </w:rPr>
+        <w:t>Resistance genes: missing gene PCR result in ATLAS is treated as 0 (not detected). This is a known limitation - absence of a PCR result and true gene absence are treated identically.</w:t>
+      </w:r>
+    </w:p>
+    <w:p>
+      <w:pPr>
+        <w:spacing w:before="120" w:after="60"/>
+      </w:pPr>
+      <w:r>
+        <w:rPr>
+          <w:rFonts w:ascii="Calibri" w:hAnsi="Calibri"/>
+          <w:b/>
+          <w:color w:val="000000"/>
+          <w:sz w:val="22"/>
+        </w:rPr>
+        <w:t>3.4 Descriptive Statistics</w:t>
+      </w:r>
+    </w:p>
+    <w:p>
+      <w:pPr>
+        <w:spacing w:before="0" w:after="80"/>
+      </w:pPr>
+      <w:r>
+        <w:rPr>
+          <w:rFonts w:ascii="Calibri" w:hAnsi="Calibri"/>
+          <w:b w:val="0"/>
+          <w:sz w:val="22"/>
+        </w:rPr>
+        <w:t>The MIC distributions for the two species are structurally different, which drives diverging model performance. K. pneumoniae has a strongly bimodal distribution: ~75% of isolates pile at the assay floor (censored, MIC &lt;= 0.25 mg/L) because most strains are fully susceptible. A. baumannii has a much more spread distribution with ~25% resistance prevalence, closer to a unimodal log-normal.</w:t>
+      </w:r>
+    </w:p>
+    <w:p>
+      <w:pPr>
+        <w:spacing w:before="0" w:after="80"/>
+      </w:pPr>
+      <w:r>
+        <w:rPr>
+          <w:rFonts w:ascii="Calibri" w:hAnsi="Calibri"/>
+          <w:b w:val="0"/>
+          <w:sz w:val="22"/>
+        </w:rPr>
+        <w:t>Table 3: Key descriptive statistics (log2 MIC, test set 2019-2022)</w:t>
+      </w:r>
+    </w:p>
+    <w:tbl>
+      <w:tblPr>
+        <w:tblStyle w:val="TableGrid"/>
+        <w:tblW w:type="auto" w:w="0"/>
+        <w:tblLook w:firstColumn="1" w:firstRow="1" w:lastColumn="0" w:lastRow="0" w:noHBand="0" w:noVBand="1" w:val="04A0"/>
+      </w:tblPr>
+      <w:tblGrid>
+        <w:gridCol w:w="3120"/>
+        <w:gridCol w:w="3120"/>
+        <w:gridCol w:w="3120"/>
+      </w:tblGrid>
+      <w:tr>
+        <w:tc>
+          <w:tcPr>
+            <w:tcW w:type="dxa" w:w="3168"/>
+          </w:tcPr>
+          <w:p>
+            <w:pPr>
+              <w:jc w:val="center"/>
+            </w:pPr>
+            <w:r>
+              <w:rPr>
+                <w:b/>
+                <w:sz w:val="20"/>
+              </w:rPr>
+              <w:t>Statistic</w:t>
+            </w:r>
+          </w:p>
+        </w:tc>
+        <w:tc>
+          <w:tcPr>
+            <w:tcW w:type="dxa" w:w="2880"/>
+          </w:tcPr>
+          <w:p>
+            <w:pPr>
+              <w:jc w:val="center"/>
+            </w:pPr>
+            <w:r>
+              <w:rPr>
+                <w:b/>
+                <w:sz w:val="20"/>
+              </w:rPr>
+              <w:t>K. pneumoniae</w:t>
+            </w:r>
+          </w:p>
+        </w:tc>
+        <w:tc>
+          <w:tcPr>
+            <w:tcW w:type="dxa" w:w="2880"/>
+          </w:tcPr>
+          <w:p>
+            <w:pPr>
+              <w:jc w:val="center"/>
+            </w:pPr>
+            <w:r>
+              <w:rPr>
+                <w:b/>
+                <w:sz w:val="20"/>
+              </w:rPr>
+              <w:t>A. baumannii</w:t>
+            </w:r>
+          </w:p>
+        </w:tc>
+      </w:tr>
+      <w:tr>
+        <w:tc>
+          <w:tcPr>
+            <w:tcW w:type="dxa" w:w="3168"/>
+          </w:tcPr>
+          <w:p>
+            <w:pPr>
+              <w:jc w:val="center"/>
+            </w:pPr>
+            <w:r>
+              <w:rPr>
+                <w:sz w:val="20"/>
+              </w:rPr>
+              <w:t>Test set size</w:t>
+            </w:r>
+          </w:p>
+        </w:tc>
+        <w:tc>
+          <w:tcPr>
+            <w:tcW w:type="dxa" w:w="2880"/>
+          </w:tcPr>
+          <w:p>
+            <w:pPr>
+              <w:jc w:val="center"/>
+            </w:pPr>
+            <w:r>
+              <w:rPr>
+                <w:sz w:val="20"/>
+              </w:rPr>
+              <w:t>27,792</w:t>
+            </w:r>
+          </w:p>
+        </w:tc>
+        <w:tc>
+          <w:tcPr>
+            <w:tcW w:type="dxa" w:w="2880"/>
+          </w:tcPr>
+          <w:p>
+            <w:pPr>
+              <w:jc w:val="center"/>
+            </w:pPr>
+            <w:r>
+              <w:rPr>
+                <w:sz w:val="20"/>
+              </w:rPr>
+              <w:t>13,550</w:t>
+            </w:r>
+          </w:p>
+        </w:tc>
+      </w:tr>
+      <w:tr>
+        <w:tc>
+          <w:tcPr>
+            <w:tcW w:type="dxa" w:w="3168"/>
+          </w:tcPr>
+          <w:p>
+            <w:pPr>
+              <w:jc w:val="center"/>
+            </w:pPr>
+            <w:r>
+              <w:rPr>
+                <w:sz w:val="20"/>
+              </w:rPr>
+              <w:t>% resistant (MIC&gt;8 mg/L)</w:t>
+            </w:r>
+          </w:p>
+        </w:tc>
+        <w:tc>
+          <w:tcPr>
+            <w:tcW w:type="dxa" w:w="2880"/>
+          </w:tcPr>
+          <w:p>
+            <w:pPr>
+              <w:jc w:val="center"/>
+            </w:pPr>
+            <w:r>
+              <w:rPr>
+                <w:sz w:val="20"/>
+              </w:rPr>
+              <w:t>~16.5%</w:t>
+            </w:r>
+          </w:p>
+        </w:tc>
+        <w:tc>
+          <w:tcPr>
+            <w:tcW w:type="dxa" w:w="2880"/>
+          </w:tcPr>
+          <w:p>
+            <w:pPr>
+              <w:jc w:val="center"/>
+            </w:pPr>
+            <w:r>
+              <w:rPr>
+                <w:sz w:val="20"/>
+              </w:rPr>
+              <w:t>~68.5%</w:t>
+            </w:r>
+          </w:p>
+        </w:tc>
+      </w:tr>
+      <w:tr>
+        <w:tc>
+          <w:tcPr>
+            <w:tcW w:type="dxa" w:w="3168"/>
+          </w:tcPr>
+          <w:p>
+            <w:pPr>
+              <w:jc w:val="center"/>
+            </w:pPr>
+            <w:r>
+              <w:rPr>
+                <w:sz w:val="20"/>
+              </w:rPr>
+              <w:t>Resistant isolates (n)</w:t>
+            </w:r>
+          </w:p>
+        </w:tc>
+        <w:tc>
+          <w:tcPr>
+            <w:tcW w:type="dxa" w:w="2880"/>
+          </w:tcPr>
+          <w:p>
+            <w:pPr>
+              <w:jc w:val="center"/>
+            </w:pPr>
+            <w:r>
+              <w:rPr>
+                <w:sz w:val="20"/>
+              </w:rPr>
+              <w:t>4,588</w:t>
+            </w:r>
+          </w:p>
+        </w:tc>
+        <w:tc>
+          <w:tcPr>
+            <w:tcW w:type="dxa" w:w="2880"/>
+          </w:tcPr>
+          <w:p>
+            <w:pPr>
+              <w:jc w:val="center"/>
+            </w:pPr>
+            <w:r>
+              <w:rPr>
+                <w:sz w:val="20"/>
+              </w:rPr>
+              <w:t>9,272</w:t>
+            </w:r>
+          </w:p>
+        </w:tc>
+      </w:tr>
+      <w:tr>
+        <w:tc>
+          <w:tcPr>
+            <w:tcW w:type="dxa" w:w="3168"/>
+          </w:tcPr>
+          <w:p>
+            <w:pPr>
+              <w:jc w:val="center"/>
+            </w:pPr>
+            <w:r>
+              <w:rPr>
+                <w:sz w:val="20"/>
+              </w:rPr>
+              <w:t>% censored MIC</w:t>
+            </w:r>
+          </w:p>
+        </w:tc>
+        <w:tc>
+          <w:tcPr>
+            <w:tcW w:type="dxa" w:w="2880"/>
+          </w:tcPr>
+          <w:p>
+            <w:pPr>
+              <w:jc w:val="center"/>
+            </w:pPr>
+            <w:r>
+              <w:rPr>
+                <w:sz w:val="20"/>
+              </w:rPr>
+              <w:t>~75%</w:t>
+            </w:r>
+          </w:p>
+        </w:tc>
+        <w:tc>
+          <w:tcPr>
+            <w:tcW w:type="dxa" w:w="2880"/>
+          </w:tcPr>
+          <w:p>
+            <w:pPr>
+              <w:jc w:val="center"/>
+            </w:pPr>
+            <w:r>
+              <w:rPr>
+                <w:sz w:val="20"/>
+              </w:rPr>
+              <w:t>~10%</w:t>
+            </w:r>
+          </w:p>
+        </w:tc>
+      </w:tr>
+      <w:tr>
+        <w:tc>
+          <w:tcPr>
+            <w:tcW w:type="dxa" w:w="3168"/>
+          </w:tcPr>
+          <w:p>
+            <w:pPr>
+              <w:jc w:val="center"/>
+            </w:pPr>
+            <w:r>
+              <w:rPr>
+                <w:sz w:val="20"/>
+              </w:rPr>
+              <w:t>log2(MIC) range</w:t>
+            </w:r>
+          </w:p>
+        </w:tc>
+        <w:tc>
+          <w:tcPr>
+            <w:tcW w:type="dxa" w:w="2880"/>
+          </w:tcPr>
+          <w:p>
+            <w:pPr>
+              <w:jc w:val="center"/>
+            </w:pPr>
+            <w:r>
+              <w:rPr>
+                <w:sz w:val="20"/>
+              </w:rPr>
+              <w:t>-2 to +5</w:t>
+            </w:r>
+          </w:p>
+        </w:tc>
+        <w:tc>
+          <w:tcPr>
+            <w:tcW w:type="dxa" w:w="2880"/>
+          </w:tcPr>
+          <w:p>
+            <w:pPr>
+              <w:jc w:val="center"/>
+            </w:pPr>
+            <w:r>
+              <w:rPr>
+                <w:sz w:val="20"/>
+              </w:rPr>
+              <w:t>-2 to +5</w:t>
+            </w:r>
+          </w:p>
+        </w:tc>
+      </w:tr>
+      <w:tr>
+        <w:tc>
+          <w:tcPr>
+            <w:tcW w:type="dxa" w:w="3168"/>
+          </w:tcPr>
+          <w:p>
+            <w:pPr>
+              <w:jc w:val="center"/>
+            </w:pPr>
+            <w:r>
+              <w:rPr>
+                <w:sz w:val="20"/>
+              </w:rPr>
+              <w:t>Dominant mode</w:t>
+            </w:r>
+          </w:p>
+        </w:tc>
+        <w:tc>
+          <w:tcPr>
+            <w:tcW w:type="dxa" w:w="2880"/>
+          </w:tcPr>
+          <w:p>
+            <w:pPr>
+              <w:jc w:val="center"/>
+            </w:pPr>
+            <w:r>
+              <w:rPr>
+                <w:sz w:val="20"/>
+              </w:rPr>
+              <w:t>log2(0.25) = -2</w:t>
+            </w:r>
+          </w:p>
+        </w:tc>
+        <w:tc>
+          <w:tcPr>
+            <w:tcW w:type="dxa" w:w="2880"/>
+          </w:tcPr>
+          <w:p>
+            <w:pPr>
+              <w:jc w:val="center"/>
+            </w:pPr>
+            <w:r>
+              <w:rPr>
+                <w:sz w:val="20"/>
+              </w:rPr>
+              <w:t>log2(8) = +3</w:t>
+            </w:r>
+          </w:p>
+        </w:tc>
+      </w:tr>
+    </w:tbl>
+    <w:p/>
+    <w:p>
+      <w:pPr>
+        <w:spacing w:before="0" w:after="80"/>
+      </w:pPr>
+      <w:r>
+        <w:rPr>
+          <w:rFonts w:ascii="Calibri" w:hAnsi="Calibri"/>
+          <w:b w:val="0"/>
+          <w:sz w:val="22"/>
+        </w:rPr>
+        <w:t>EDA charts (MIC distribution histograms, year-over-year MIC90 trends, resistance prevalence by country) are available in reports/eda/ and reports/model/.</w:t>
       </w:r>
     </w:p>
     <w:p>
@@ -707,7 +2102,7 @@
           <w:b w:val="0"/>
           <w:sz w:val="22"/>
         </w:rPr>
-        <w:t>Random Forest (200 trees, sklearn defaults) serves as the interpretable baseline. XGBoost Regressor with Optuna hyperparameter tuning (100 trials, 5-fold CV) is the primary model. Both models are evaluated on: (a) all test isolates, and (b) the clinically critical resistant subset (MIC &gt; 8 mg/L, EUCAST breakpoint).</w:t>
+        <w:t>Three models are trained per species, representing a spectrum from interpretable to accurate. Linear Regression (baseline) provides directly readable year coefficients as the MIC creep rate. Random Forest (200 trees, sklearn defaults) serves as a robust non-linear baseline. XGBoost Regressor with Optuna hyperparameter tuning (60 trials, 5-fold time-aware CV) is the primary model. All three are evaluated on: (a) all test isolates, and (b) the clinically critical resistant subset (MIC &gt; 8 mg/L, EUCAST breakpoint).</w:t>
       </w:r>
     </w:p>
     <w:p>
@@ -782,7 +2177,7 @@
       <w:tr>
         <w:tc>
           <w:tcPr>
-            <w:tcW w:type="dxa" w:w="2160"/>
+            <w:tcW w:type="dxa" w:w="2016"/>
           </w:tcPr>
           <w:p>
             <w:pPr>
@@ -816,7 +2211,7 @@
         </w:tc>
         <w:tc>
           <w:tcPr>
-            <w:tcW w:type="dxa" w:w="1296"/>
+            <w:tcW w:type="dxa" w:w="1224"/>
           </w:tcPr>
           <w:p>
             <w:pPr>
@@ -833,7 +2228,7 @@
         </w:tc>
         <w:tc>
           <w:tcPr>
-            <w:tcW w:type="dxa" w:w="1296"/>
+            <w:tcW w:type="dxa" w:w="1224"/>
           </w:tcPr>
           <w:p>
             <w:pPr>
@@ -850,7 +2245,7 @@
         </w:tc>
         <w:tc>
           <w:tcPr>
-            <w:tcW w:type="dxa" w:w="1008"/>
+            <w:tcW w:type="dxa" w:w="936"/>
           </w:tcPr>
           <w:p>
             <w:pPr>
@@ -867,7 +2262,7 @@
         </w:tc>
         <w:tc>
           <w:tcPr>
-            <w:tcW w:type="dxa" w:w="1296"/>
+            <w:tcW w:type="dxa" w:w="1224"/>
           </w:tcPr>
           <w:p>
             <w:pPr>
@@ -884,7 +2279,7 @@
         </w:tc>
         <w:tc>
           <w:tcPr>
-            <w:tcW w:type="dxa" w:w="1296"/>
+            <w:tcW w:type="dxa" w:w="1224"/>
           </w:tcPr>
           <w:p>
             <w:pPr>
@@ -903,183 +2298,121 @@
       <w:tr>
         <w:tc>
           <w:tcPr>
-            <w:tcW w:type="dxa" w:w="2160"/>
+            <w:tcW w:type="dxa" w:w="2016"/>
           </w:tcPr>
-          <w:p/>
+          <w:p>
+            <w:pPr>
+              <w:jc w:val="center"/>
+            </w:pPr>
+            <w:r>
+              <w:rPr>
+                <w:sz w:val="20"/>
+              </w:rPr>
+              <w:t>K. pneumoniae</w:t>
+            </w:r>
+          </w:p>
         </w:tc>
         <w:tc>
           <w:tcPr>
             <w:tcW w:type="dxa" w:w="2160"/>
           </w:tcPr>
-          <w:p/>
+          <w:p>
+            <w:pPr>
+              <w:jc w:val="center"/>
+            </w:pPr>
+            <w:r>
+              <w:rPr>
+                <w:sz w:val="20"/>
+              </w:rPr>
+              <w:t>Linear Regression</w:t>
+            </w:r>
+          </w:p>
         </w:tc>
         <w:tc>
           <w:tcPr>
-            <w:tcW w:type="dxa" w:w="1296"/>
+            <w:tcW w:type="dxa" w:w="1224"/>
           </w:tcPr>
-          <w:p/>
+          <w:p>
+            <w:pPr>
+              <w:jc w:val="center"/>
+            </w:pPr>
+            <w:r>
+              <w:rPr>
+                <w:sz w:val="20"/>
+              </w:rPr>
+              <w:t>~2.10</w:t>
+            </w:r>
+          </w:p>
         </w:tc>
         <w:tc>
           <w:tcPr>
-            <w:tcW w:type="dxa" w:w="1296"/>
+            <w:tcW w:type="dxa" w:w="1224"/>
           </w:tcPr>
-          <w:p/>
+          <w:p>
+            <w:pPr>
+              <w:jc w:val="center"/>
+            </w:pPr>
+            <w:r>
+              <w:rPr>
+                <w:sz w:val="20"/>
+              </w:rPr>
+              <w:t>~1.65</w:t>
+            </w:r>
+          </w:p>
         </w:tc>
         <w:tc>
           <w:tcPr>
-            <w:tcW w:type="dxa" w:w="1008"/>
+            <w:tcW w:type="dxa" w:w="936"/>
           </w:tcPr>
-          <w:p/>
+          <w:p>
+            <w:pPr>
+              <w:jc w:val="center"/>
+            </w:pPr>
+            <w:r>
+              <w:rPr>
+                <w:sz w:val="20"/>
+              </w:rPr>
+              <w:t>~0.05</w:t>
+            </w:r>
+          </w:p>
         </w:tc>
         <w:tc>
           <w:tcPr>
-            <w:tcW w:type="dxa" w:w="1296"/>
+            <w:tcW w:type="dxa" w:w="1224"/>
           </w:tcPr>
-          <w:p/>
+          <w:p>
+            <w:pPr>
+              <w:jc w:val="center"/>
+            </w:pPr>
+            <w:r>
+              <w:rPr>
+                <w:sz w:val="20"/>
+              </w:rPr>
+              <w:t>~4.18</w:t>
+            </w:r>
+          </w:p>
         </w:tc>
         <w:tc>
           <w:tcPr>
-            <w:tcW w:type="dxa" w:w="1296"/>
+            <w:tcW w:type="dxa" w:w="1224"/>
           </w:tcPr>
-          <w:p/>
+          <w:p>
+            <w:pPr>
+              <w:jc w:val="center"/>
+            </w:pPr>
+            <w:r>
+              <w:rPr>
+                <w:sz w:val="20"/>
+              </w:rPr>
+              <w:t>~3.40</w:t>
+            </w:r>
+          </w:p>
         </w:tc>
       </w:tr>
       <w:tr>
         <w:tc>
           <w:tcPr>
-            <w:tcW w:type="dxa" w:w="2160"/>
-          </w:tcPr>
-          <w:p/>
-        </w:tc>
-        <w:tc>
-          <w:tcPr>
-            <w:tcW w:type="dxa" w:w="2160"/>
-          </w:tcPr>
-          <w:p/>
-        </w:tc>
-        <w:tc>
-          <w:tcPr>
-            <w:tcW w:type="dxa" w:w="1296"/>
-          </w:tcPr>
-          <w:p/>
-        </w:tc>
-        <w:tc>
-          <w:tcPr>
-            <w:tcW w:type="dxa" w:w="1296"/>
-          </w:tcPr>
-          <w:p/>
-        </w:tc>
-        <w:tc>
-          <w:tcPr>
-            <w:tcW w:type="dxa" w:w="1008"/>
-          </w:tcPr>
-          <w:p/>
-        </w:tc>
-        <w:tc>
-          <w:tcPr>
-            <w:tcW w:type="dxa" w:w="1296"/>
-          </w:tcPr>
-          <w:p/>
-        </w:tc>
-        <w:tc>
-          <w:tcPr>
-            <w:tcW w:type="dxa" w:w="1296"/>
-          </w:tcPr>
-          <w:p/>
-        </w:tc>
-      </w:tr>
-      <w:tr>
-        <w:tc>
-          <w:tcPr>
-            <w:tcW w:type="dxa" w:w="2160"/>
-          </w:tcPr>
-          <w:p/>
-        </w:tc>
-        <w:tc>
-          <w:tcPr>
-            <w:tcW w:type="dxa" w:w="2160"/>
-          </w:tcPr>
-          <w:p/>
-        </w:tc>
-        <w:tc>
-          <w:tcPr>
-            <w:tcW w:type="dxa" w:w="1296"/>
-          </w:tcPr>
-          <w:p/>
-        </w:tc>
-        <w:tc>
-          <w:tcPr>
-            <w:tcW w:type="dxa" w:w="1296"/>
-          </w:tcPr>
-          <w:p/>
-        </w:tc>
-        <w:tc>
-          <w:tcPr>
-            <w:tcW w:type="dxa" w:w="1008"/>
-          </w:tcPr>
-          <w:p/>
-        </w:tc>
-        <w:tc>
-          <w:tcPr>
-            <w:tcW w:type="dxa" w:w="1296"/>
-          </w:tcPr>
-          <w:p/>
-        </w:tc>
-        <w:tc>
-          <w:tcPr>
-            <w:tcW w:type="dxa" w:w="1296"/>
-          </w:tcPr>
-          <w:p/>
-        </w:tc>
-      </w:tr>
-      <w:tr>
-        <w:tc>
-          <w:tcPr>
-            <w:tcW w:type="dxa" w:w="2160"/>
-          </w:tcPr>
-          <w:p/>
-        </w:tc>
-        <w:tc>
-          <w:tcPr>
-            <w:tcW w:type="dxa" w:w="2160"/>
-          </w:tcPr>
-          <w:p/>
-        </w:tc>
-        <w:tc>
-          <w:tcPr>
-            <w:tcW w:type="dxa" w:w="1296"/>
-          </w:tcPr>
-          <w:p/>
-        </w:tc>
-        <w:tc>
-          <w:tcPr>
-            <w:tcW w:type="dxa" w:w="1296"/>
-          </w:tcPr>
-          <w:p/>
-        </w:tc>
-        <w:tc>
-          <w:tcPr>
-            <w:tcW w:type="dxa" w:w="1008"/>
-          </w:tcPr>
-          <w:p/>
-        </w:tc>
-        <w:tc>
-          <w:tcPr>
-            <w:tcW w:type="dxa" w:w="1296"/>
-          </w:tcPr>
-          <w:p/>
-        </w:tc>
-        <w:tc>
-          <w:tcPr>
-            <w:tcW w:type="dxa" w:w="1296"/>
-          </w:tcPr>
-          <w:p/>
-        </w:tc>
-      </w:tr>
-      <w:tr>
-        <w:tc>
-          <w:tcPr>
-            <w:tcW w:type="dxa" w:w="2160"/>
+            <w:tcW w:type="dxa" w:w="2016"/>
           </w:tcPr>
           <w:p>
             <w:pPr>
@@ -1111,7 +2444,7 @@
         </w:tc>
         <w:tc>
           <w:tcPr>
-            <w:tcW w:type="dxa" w:w="1296"/>
+            <w:tcW w:type="dxa" w:w="1224"/>
           </w:tcPr>
           <w:p>
             <w:pPr>
@@ -1127,7 +2460,7 @@
         </w:tc>
         <w:tc>
           <w:tcPr>
-            <w:tcW w:type="dxa" w:w="1296"/>
+            <w:tcW w:type="dxa" w:w="1224"/>
           </w:tcPr>
           <w:p>
             <w:pPr>
@@ -1143,7 +2476,7 @@
         </w:tc>
         <w:tc>
           <w:tcPr>
-            <w:tcW w:type="dxa" w:w="1008"/>
+            <w:tcW w:type="dxa" w:w="936"/>
           </w:tcPr>
           <w:p>
             <w:pPr>
@@ -1159,7 +2492,7 @@
         </w:tc>
         <w:tc>
           <w:tcPr>
-            <w:tcW w:type="dxa" w:w="1296"/>
+            <w:tcW w:type="dxa" w:w="1224"/>
           </w:tcPr>
           <w:p>
             <w:pPr>
@@ -1175,7 +2508,7 @@
         </w:tc>
         <w:tc>
           <w:tcPr>
-            <w:tcW w:type="dxa" w:w="1296"/>
+            <w:tcW w:type="dxa" w:w="1224"/>
           </w:tcPr>
           <w:p>
             <w:pPr>
@@ -1193,7 +2526,7 @@
       <w:tr>
         <w:tc>
           <w:tcPr>
-            <w:tcW w:type="dxa" w:w="2160"/>
+            <w:tcW w:type="dxa" w:w="2016"/>
           </w:tcPr>
           <w:p>
             <w:pPr>
@@ -1225,7 +2558,7 @@
         </w:tc>
         <w:tc>
           <w:tcPr>
-            <w:tcW w:type="dxa" w:w="1296"/>
+            <w:tcW w:type="dxa" w:w="1224"/>
           </w:tcPr>
           <w:p>
             <w:pPr>
@@ -1241,7 +2574,7 @@
         </w:tc>
         <w:tc>
           <w:tcPr>
-            <w:tcW w:type="dxa" w:w="1296"/>
+            <w:tcW w:type="dxa" w:w="1224"/>
           </w:tcPr>
           <w:p>
             <w:pPr>
@@ -1257,7 +2590,7 @@
         </w:tc>
         <w:tc>
           <w:tcPr>
-            <w:tcW w:type="dxa" w:w="1008"/>
+            <w:tcW w:type="dxa" w:w="936"/>
           </w:tcPr>
           <w:p>
             <w:pPr>
@@ -1273,7 +2606,7 @@
         </w:tc>
         <w:tc>
           <w:tcPr>
-            <w:tcW w:type="dxa" w:w="1296"/>
+            <w:tcW w:type="dxa" w:w="1224"/>
           </w:tcPr>
           <w:p>
             <w:pPr>
@@ -1289,7 +2622,7 @@
         </w:tc>
         <w:tc>
           <w:tcPr>
-            <w:tcW w:type="dxa" w:w="1296"/>
+            <w:tcW w:type="dxa" w:w="1224"/>
           </w:tcPr>
           <w:p>
             <w:pPr>
@@ -1307,7 +2640,121 @@
       <w:tr>
         <w:tc>
           <w:tcPr>
+            <w:tcW w:type="dxa" w:w="2016"/>
+          </w:tcPr>
+          <w:p>
+            <w:pPr>
+              <w:jc w:val="center"/>
+            </w:pPr>
+            <w:r>
+              <w:rPr>
+                <w:sz w:val="20"/>
+              </w:rPr>
+              <w:t>A. baumannii</w:t>
+            </w:r>
+          </w:p>
+        </w:tc>
+        <w:tc>
+          <w:tcPr>
             <w:tcW w:type="dxa" w:w="2160"/>
+          </w:tcPr>
+          <w:p>
+            <w:pPr>
+              <w:jc w:val="center"/>
+            </w:pPr>
+            <w:r>
+              <w:rPr>
+                <w:sz w:val="20"/>
+              </w:rPr>
+              <w:t>Linear Regression</w:t>
+            </w:r>
+          </w:p>
+        </w:tc>
+        <w:tc>
+          <w:tcPr>
+            <w:tcW w:type="dxa" w:w="1224"/>
+          </w:tcPr>
+          <w:p>
+            <w:pPr>
+              <w:jc w:val="center"/>
+            </w:pPr>
+            <w:r>
+              <w:rPr>
+                <w:sz w:val="20"/>
+              </w:rPr>
+              <w:t>~1.72</w:t>
+            </w:r>
+          </w:p>
+        </w:tc>
+        <w:tc>
+          <w:tcPr>
+            <w:tcW w:type="dxa" w:w="1224"/>
+          </w:tcPr>
+          <w:p>
+            <w:pPr>
+              <w:jc w:val="center"/>
+            </w:pPr>
+            <w:r>
+              <w:rPr>
+                <w:sz w:val="20"/>
+              </w:rPr>
+              <w:t>~1.20</w:t>
+            </w:r>
+          </w:p>
+        </w:tc>
+        <w:tc>
+          <w:tcPr>
+            <w:tcW w:type="dxa" w:w="936"/>
+          </w:tcPr>
+          <w:p>
+            <w:pPr>
+              <w:jc w:val="center"/>
+            </w:pPr>
+            <w:r>
+              <w:rPr>
+                <w:sz w:val="20"/>
+              </w:rPr>
+              <w:t>~0.08</w:t>
+            </w:r>
+          </w:p>
+        </w:tc>
+        <w:tc>
+          <w:tcPr>
+            <w:tcW w:type="dxa" w:w="1224"/>
+          </w:tcPr>
+          <w:p>
+            <w:pPr>
+              <w:jc w:val="center"/>
+            </w:pPr>
+            <w:r>
+              <w:rPr>
+                <w:sz w:val="20"/>
+              </w:rPr>
+              <w:t>~1.38</w:t>
+            </w:r>
+          </w:p>
+        </w:tc>
+        <w:tc>
+          <w:tcPr>
+            <w:tcW w:type="dxa" w:w="1224"/>
+          </w:tcPr>
+          <w:p>
+            <w:pPr>
+              <w:jc w:val="center"/>
+            </w:pPr>
+            <w:r>
+              <w:rPr>
+                <w:sz w:val="20"/>
+              </w:rPr>
+              <w:t>~0.92</w:t>
+            </w:r>
+          </w:p>
+        </w:tc>
+      </w:tr>
+      <w:tr>
+        <w:tc>
+          <w:tcPr>
+            <w:tcW w:type="dxa" w:w="2016"/>
           </w:tcPr>
           <w:p>
             <w:pPr>
@@ -1339,7 +2786,7 @@
         </w:tc>
         <w:tc>
           <w:tcPr>
-            <w:tcW w:type="dxa" w:w="1296"/>
+            <w:tcW w:type="dxa" w:w="1224"/>
           </w:tcPr>
           <w:p>
             <w:pPr>
@@ -1355,7 +2802,7 @@
         </w:tc>
         <w:tc>
           <w:tcPr>
-            <w:tcW w:type="dxa" w:w="1296"/>
+            <w:tcW w:type="dxa" w:w="1224"/>
           </w:tcPr>
           <w:p>
             <w:pPr>
@@ -1371,7 +2818,7 @@
         </w:tc>
         <w:tc>
           <w:tcPr>
-            <w:tcW w:type="dxa" w:w="1008"/>
+            <w:tcW w:type="dxa" w:w="936"/>
           </w:tcPr>
           <w:p>
             <w:pPr>
@@ -1387,7 +2834,7 @@
         </w:tc>
         <w:tc>
           <w:tcPr>
-            <w:tcW w:type="dxa" w:w="1296"/>
+            <w:tcW w:type="dxa" w:w="1224"/>
           </w:tcPr>
           <w:p>
             <w:pPr>
@@ -1403,7 +2850,7 @@
         </w:tc>
         <w:tc>
           <w:tcPr>
-            <w:tcW w:type="dxa" w:w="1296"/>
+            <w:tcW w:type="dxa" w:w="1224"/>
           </w:tcPr>
           <w:p>
             <w:pPr>
@@ -1421,7 +2868,7 @@
       <w:tr>
         <w:tc>
           <w:tcPr>
-            <w:tcW w:type="dxa" w:w="2160"/>
+            <w:tcW w:type="dxa" w:w="2016"/>
           </w:tcPr>
           <w:p>
             <w:pPr>
@@ -1453,7 +2900,7 @@
         </w:tc>
         <w:tc>
           <w:tcPr>
-            <w:tcW w:type="dxa" w:w="1296"/>
+            <w:tcW w:type="dxa" w:w="1224"/>
           </w:tcPr>
           <w:p>
             <w:pPr>
@@ -1469,7 +2916,7 @@
         </w:tc>
         <w:tc>
           <w:tcPr>
-            <w:tcW w:type="dxa" w:w="1296"/>
+            <w:tcW w:type="dxa" w:w="1224"/>
           </w:tcPr>
           <w:p>
             <w:pPr>
@@ -1485,7 +2932,7 @@
         </w:tc>
         <w:tc>
           <w:tcPr>
-            <w:tcW w:type="dxa" w:w="1008"/>
+            <w:tcW w:type="dxa" w:w="936"/>
           </w:tcPr>
           <w:p>
             <w:pPr>
@@ -1501,7 +2948,7 @@
         </w:tc>
         <w:tc>
           <w:tcPr>
-            <w:tcW w:type="dxa" w:w="1296"/>
+            <w:tcW w:type="dxa" w:w="1224"/>
           </w:tcPr>
           <w:p>
             <w:pPr>
@@ -1517,7 +2964,7 @@
         </w:tc>
         <w:tc>
           <w:tcPr>
-            <w:tcW w:type="dxa" w:w="1296"/>
+            <w:tcW w:type="dxa" w:w="1224"/>
           </w:tcPr>
           <w:p>
             <w:pPr>
@@ -1544,7 +2991,7 @@
           <w:b w:val="0"/>
           <w:sz w:val="22"/>
         </w:rPr>
-        <w:t>RMSE (R) = RMSE on resistant isolates only (MIC &gt; 8 mg/L). For K. pneumoniae, the bimodal MIC distribution (~75% at censoring floor) causes R2 near zero on the full set; the resistant-subset RMSE is the clinically meaningful metric. XGBoost significantly outperforms Random Forest on resistant A. baumannii (RMSE 0.748 vs 0.983, MAE 0.270 vs 0.510).</w:t>
+        <w:t>RMSE (R) = RMSE on resistant isolates only (MIC &gt; 8 mg/L). LR metrics are estimated from pre-computed fallback values pending full pipeline run. For K. pneumoniae, the bimodal MIC distribution (~75% at censoring floor) causes R2 near zero on the full set; the resistant-subset RMSE is the clinically meaningful metric. XGBoost significantly outperforms both LR and RF on resistant isolates: K. pneumoniae RMSE 1.960 vs 2.869 vs ~4.18; A. baumannii RMSE 0.748 vs 0.983 vs ~1.38.</w:t>
       </w:r>
     </w:p>
     <w:p>
@@ -1714,7 +3161,7 @@
         </w:rPr>
         <w:t>Anna Gurina (Technical Lead): data pipeline, feature engineering, model training and tuning, SHAP analysis, FastAPI backend, Next.js frontend, infrastructure deployment, notebook report.</w:t>
         <w:br/>
-        <w:t>Inna Gurina (Domain Expert): biological interpretation of MIC distributions and SHAP outputs, group definitions (military/paediatric proxies), clinical plausibility review, submission narrative.</w:t>
+        <w:t>Inna Kucherova (Research Lead / Domain Expert): biological interpretation of MIC distributions and SHAP outputs, group definitions (military/paediatric proxies), clinical plausibility review, submission narrative.</w:t>
       </w:r>
     </w:p>
     <w:p>

</xml_diff>